<commit_message>
All Regular Retain Ran
</commit_message>
<xml_diff>
--- a/Tables_to_Fill.docx
+++ b/Tables_to_Fill.docx
@@ -969,224 +969,251 @@
             </w:pPr>
             <w:r>
               <w:rPr>
-                <w:rtl w:val="0"/>
-              </w:rPr>
-            </w:r>
-          </w:p>
-        </w:tc>
-        <w:tc>
-          <w:tcPr>
-            <w:shd w:fill="auto" w:val="clear"/>
-            <w:tcMar>
-              <w:top w:w="100.0" w:type="dxa"/>
-              <w:left w:w="100.0" w:type="dxa"/>
-              <w:bottom w:w="100.0" w:type="dxa"/>
-              <w:right w:w="100.0" w:type="dxa"/>
-            </w:tcMar>
-            <w:vAlign w:val="top"/>
-          </w:tcPr>
-          <w:p>
-            <w:pPr>
-              <w:widowControl w:val="0"/>
-              <w:spacing w:line="240" w:lineRule="auto"/>
-              <w:rPr>
-                <w:sz w:val="16"/>
-                <w:szCs w:val="16"/>
-              </w:rPr>
-            </w:pPr>
-            <w:r>
-              <w:rPr>
-                <w:rtl w:val="0"/>
-              </w:rPr>
-            </w:r>
-          </w:p>
-        </w:tc>
-        <w:tc>
-          <w:tcPr>
-            <w:shd w:fill="auto" w:val="clear"/>
-            <w:tcMar>
-              <w:top w:w="100.0" w:type="dxa"/>
-              <w:left w:w="100.0" w:type="dxa"/>
-              <w:bottom w:w="100.0" w:type="dxa"/>
-              <w:right w:w="100.0" w:type="dxa"/>
-            </w:tcMar>
-            <w:vAlign w:val="top"/>
-          </w:tcPr>
-          <w:p>
-            <w:pPr>
-              <w:widowControl w:val="0"/>
-              <w:spacing w:line="240" w:lineRule="auto"/>
-              <w:rPr>
-                <w:sz w:val="16"/>
-                <w:szCs w:val="16"/>
-              </w:rPr>
-            </w:pPr>
-            <w:r>
-              <w:rPr>
-                <w:rtl w:val="0"/>
-              </w:rPr>
-            </w:r>
-          </w:p>
-        </w:tc>
-        <w:tc>
-          <w:tcPr>
-            <w:shd w:fill="auto" w:val="clear"/>
-            <w:tcMar>
-              <w:top w:w="100.0" w:type="dxa"/>
-              <w:left w:w="100.0" w:type="dxa"/>
-              <w:bottom w:w="100.0" w:type="dxa"/>
-              <w:right w:w="100.0" w:type="dxa"/>
-            </w:tcMar>
-            <w:vAlign w:val="top"/>
-          </w:tcPr>
-          <w:p>
-            <w:pPr>
-              <w:widowControl w:val="0"/>
-              <w:spacing w:line="240" w:lineRule="auto"/>
-              <w:rPr>
-                <w:sz w:val="16"/>
-                <w:szCs w:val="16"/>
-              </w:rPr>
-            </w:pPr>
-            <w:r>
-              <w:rPr>
-                <w:rtl w:val="0"/>
-              </w:rPr>
-            </w:r>
-          </w:p>
-        </w:tc>
-        <w:tc>
-          <w:tcPr>
-            <w:shd w:fill="auto" w:val="clear"/>
-            <w:tcMar>
-              <w:top w:w="100.0" w:type="dxa"/>
-              <w:left w:w="100.0" w:type="dxa"/>
-              <w:bottom w:w="100.0" w:type="dxa"/>
-              <w:right w:w="100.0" w:type="dxa"/>
-            </w:tcMar>
-            <w:vAlign w:val="top"/>
-          </w:tcPr>
-          <w:p>
-            <w:pPr>
-              <w:widowControl w:val="0"/>
-              <w:spacing w:line="240" w:lineRule="auto"/>
-              <w:rPr>
-                <w:sz w:val="16"/>
-                <w:szCs w:val="16"/>
-              </w:rPr>
-            </w:pPr>
-            <w:r>
-              <w:rPr>
-                <w:rtl w:val="0"/>
-              </w:rPr>
-            </w:r>
-          </w:p>
-        </w:tc>
-        <w:tc>
-          <w:tcPr>
-            <w:shd w:fill="auto" w:val="clear"/>
-            <w:tcMar>
-              <w:top w:w="100.0" w:type="dxa"/>
-              <w:left w:w="100.0" w:type="dxa"/>
-              <w:bottom w:w="100.0" w:type="dxa"/>
-              <w:right w:w="100.0" w:type="dxa"/>
-            </w:tcMar>
-            <w:vAlign w:val="top"/>
-          </w:tcPr>
-          <w:p>
-            <w:pPr>
-              <w:widowControl w:val="0"/>
-              <w:spacing w:line="240" w:lineRule="auto"/>
-              <w:rPr>
-                <w:sz w:val="16"/>
-                <w:szCs w:val="16"/>
-              </w:rPr>
-            </w:pPr>
-            <w:r>
-              <w:rPr>
-                <w:rtl w:val="0"/>
-              </w:rPr>
-            </w:r>
-          </w:p>
-        </w:tc>
-        <w:tc>
-          <w:tcPr>
-            <w:shd w:fill="auto" w:val="clear"/>
-            <w:tcMar>
-              <w:top w:w="100.0" w:type="dxa"/>
-              <w:left w:w="100.0" w:type="dxa"/>
-              <w:bottom w:w="100.0" w:type="dxa"/>
-              <w:right w:w="100.0" w:type="dxa"/>
-            </w:tcMar>
-            <w:vAlign w:val="top"/>
-          </w:tcPr>
-          <w:p>
-            <w:pPr>
-              <w:widowControl w:val="0"/>
-              <w:spacing w:line="240" w:lineRule="auto"/>
-              <w:rPr>
-                <w:sz w:val="16"/>
-                <w:szCs w:val="16"/>
-              </w:rPr>
-            </w:pPr>
-            <w:r>
-              <w:rPr>
-                <w:rtl w:val="0"/>
-              </w:rPr>
-            </w:r>
-          </w:p>
-        </w:tc>
-        <w:tc>
-          <w:tcPr>
-            <w:shd w:fill="auto" w:val="clear"/>
-            <w:tcMar>
-              <w:top w:w="100.0" w:type="dxa"/>
-              <w:left w:w="100.0" w:type="dxa"/>
-              <w:bottom w:w="100.0" w:type="dxa"/>
-              <w:right w:w="100.0" w:type="dxa"/>
-            </w:tcMar>
-            <w:vAlign w:val="top"/>
-          </w:tcPr>
-          <w:p>
-            <w:pPr>
-              <w:widowControl w:val="0"/>
-              <w:spacing w:line="240" w:lineRule="auto"/>
-              <w:rPr>
-                <w:sz w:val="16"/>
-                <w:szCs w:val="16"/>
-              </w:rPr>
-            </w:pPr>
-            <w:r>
-              <w:rPr>
-                <w:rtl w:val="0"/>
-              </w:rPr>
-            </w:r>
-          </w:p>
-        </w:tc>
-        <w:tc>
-          <w:tcPr>
-            <w:shd w:fill="auto" w:val="clear"/>
-            <w:tcMar>
-              <w:top w:w="100.0" w:type="dxa"/>
-              <w:left w:w="100.0" w:type="dxa"/>
-              <w:bottom w:w="100.0" w:type="dxa"/>
-              <w:right w:w="100.0" w:type="dxa"/>
-            </w:tcMar>
-            <w:vAlign w:val="top"/>
-          </w:tcPr>
-          <w:p>
-            <w:pPr>
-              <w:widowControl w:val="0"/>
-              <w:spacing w:line="240" w:lineRule="auto"/>
-              <w:rPr>
-                <w:sz w:val="16"/>
-                <w:szCs w:val="16"/>
-              </w:rPr>
-            </w:pPr>
-            <w:r>
-              <w:rPr>
-                <w:rtl w:val="0"/>
-              </w:rPr>
+                <w:sz w:val="16"/>
+                <w:szCs w:val="16"/>
+                <w:rtl w:val="0"/>
+              </w:rPr>
+              <w:t xml:space="preserve">0.6527994253989591</w:t>
+            </w:r>
+          </w:p>
+        </w:tc>
+        <w:tc>
+          <w:tcPr>
+            <w:shd w:fill="auto" w:val="clear"/>
+            <w:tcMar>
+              <w:top w:w="100.0" w:type="dxa"/>
+              <w:left w:w="100.0" w:type="dxa"/>
+              <w:bottom w:w="100.0" w:type="dxa"/>
+              <w:right w:w="100.0" w:type="dxa"/>
+            </w:tcMar>
+            <w:vAlign w:val="top"/>
+          </w:tcPr>
+          <w:p>
+            <w:pPr>
+              <w:widowControl w:val="0"/>
+              <w:spacing w:line="240" w:lineRule="auto"/>
+              <w:rPr>
+                <w:sz w:val="16"/>
+                <w:szCs w:val="16"/>
+              </w:rPr>
+            </w:pPr>
+            <w:r>
+              <w:rPr>
+                <w:sz w:val="16"/>
+                <w:szCs w:val="16"/>
+                <w:rtl w:val="0"/>
+              </w:rPr>
+              <w:t xml:space="preserve">0.8244883556810163</w:t>
+            </w:r>
+          </w:p>
+        </w:tc>
+        <w:tc>
+          <w:tcPr>
+            <w:shd w:fill="auto" w:val="clear"/>
+            <w:tcMar>
+              <w:top w:w="100.0" w:type="dxa"/>
+              <w:left w:w="100.0" w:type="dxa"/>
+              <w:bottom w:w="100.0" w:type="dxa"/>
+              <w:right w:w="100.0" w:type="dxa"/>
+            </w:tcMar>
+            <w:vAlign w:val="top"/>
+          </w:tcPr>
+          <w:p>
+            <w:pPr>
+              <w:widowControl w:val="0"/>
+              <w:spacing w:line="240" w:lineRule="auto"/>
+              <w:rPr>
+                <w:sz w:val="16"/>
+                <w:szCs w:val="16"/>
+              </w:rPr>
+            </w:pPr>
+            <w:r>
+              <w:rPr>
+                <w:sz w:val="16"/>
+                <w:szCs w:val="16"/>
+                <w:rtl w:val="0"/>
+              </w:rPr>
+              <w:t xml:space="preserve">0.7168313338038109</w:t>
+            </w:r>
+          </w:p>
+        </w:tc>
+        <w:tc>
+          <w:tcPr>
+            <w:shd w:fill="auto" w:val="clear"/>
+            <w:tcMar>
+              <w:top w:w="100.0" w:type="dxa"/>
+              <w:left w:w="100.0" w:type="dxa"/>
+              <w:bottom w:w="100.0" w:type="dxa"/>
+              <w:right w:w="100.0" w:type="dxa"/>
+            </w:tcMar>
+            <w:vAlign w:val="top"/>
+          </w:tcPr>
+          <w:p>
+            <w:pPr>
+              <w:widowControl w:val="0"/>
+              <w:spacing w:line="240" w:lineRule="auto"/>
+              <w:rPr>
+                <w:sz w:val="16"/>
+                <w:szCs w:val="16"/>
+              </w:rPr>
+            </w:pPr>
+            <w:r>
+              <w:rPr>
+                <w:sz w:val="16"/>
+                <w:szCs w:val="16"/>
+                <w:rtl w:val="0"/>
+              </w:rPr>
+              <w:t xml:space="preserve">0.2630178579843836</w:t>
+            </w:r>
+          </w:p>
+        </w:tc>
+        <w:tc>
+          <w:tcPr>
+            <w:shd w:fill="auto" w:val="clear"/>
+            <w:tcMar>
+              <w:top w:w="100.0" w:type="dxa"/>
+              <w:left w:w="100.0" w:type="dxa"/>
+              <w:bottom w:w="100.0" w:type="dxa"/>
+              <w:right w:w="100.0" w:type="dxa"/>
+            </w:tcMar>
+            <w:vAlign w:val="top"/>
+          </w:tcPr>
+          <w:p>
+            <w:pPr>
+              <w:widowControl w:val="0"/>
+              <w:spacing w:line="240" w:lineRule="auto"/>
+              <w:rPr>
+                <w:sz w:val="16"/>
+                <w:szCs w:val="16"/>
+              </w:rPr>
+            </w:pPr>
+            <w:r>
+              <w:rPr>
+                <w:sz w:val="16"/>
+                <w:szCs w:val="16"/>
+                <w:rtl w:val="0"/>
+              </w:rPr>
+              <w:t xml:space="preserve">0.44333200466841677</w:t>
+            </w:r>
+          </w:p>
+        </w:tc>
+        <w:tc>
+          <w:tcPr>
+            <w:shd w:fill="auto" w:val="clear"/>
+            <w:tcMar>
+              <w:top w:w="100.0" w:type="dxa"/>
+              <w:left w:w="100.0" w:type="dxa"/>
+              <w:bottom w:w="100.0" w:type="dxa"/>
+              <w:right w:w="100.0" w:type="dxa"/>
+            </w:tcMar>
+            <w:vAlign w:val="top"/>
+          </w:tcPr>
+          <w:p>
+            <w:pPr>
+              <w:widowControl w:val="0"/>
+              <w:spacing w:line="240" w:lineRule="auto"/>
+              <w:rPr>
+                <w:sz w:val="16"/>
+                <w:szCs w:val="16"/>
+              </w:rPr>
+            </w:pPr>
+            <w:r>
+              <w:rPr>
+                <w:sz w:val="16"/>
+                <w:szCs w:val="16"/>
+                <w:rtl w:val="0"/>
+              </w:rPr>
+              <w:t xml:space="preserve">0.20470651404516693</w:t>
+            </w:r>
+          </w:p>
+        </w:tc>
+        <w:tc>
+          <w:tcPr>
+            <w:shd w:fill="auto" w:val="clear"/>
+            <w:tcMar>
+              <w:top w:w="100.0" w:type="dxa"/>
+              <w:left w:w="100.0" w:type="dxa"/>
+              <w:bottom w:w="100.0" w:type="dxa"/>
+              <w:right w:w="100.0" w:type="dxa"/>
+            </w:tcMar>
+            <w:vAlign w:val="top"/>
+          </w:tcPr>
+          <w:p>
+            <w:pPr>
+              <w:widowControl w:val="0"/>
+              <w:spacing w:line="240" w:lineRule="auto"/>
+              <w:rPr>
+                <w:sz w:val="16"/>
+                <w:szCs w:val="16"/>
+              </w:rPr>
+            </w:pPr>
+            <w:r>
+              <w:rPr>
+                <w:sz w:val="16"/>
+                <w:szCs w:val="16"/>
+                <w:rtl w:val="0"/>
+              </w:rPr>
+              <w:t xml:space="preserve">0.6521749833829793</w:t>
+            </w:r>
+          </w:p>
+        </w:tc>
+        <w:tc>
+          <w:tcPr>
+            <w:shd w:fill="auto" w:val="clear"/>
+            <w:tcMar>
+              <w:top w:w="100.0" w:type="dxa"/>
+              <w:left w:w="100.0" w:type="dxa"/>
+              <w:bottom w:w="100.0" w:type="dxa"/>
+              <w:right w:w="100.0" w:type="dxa"/>
+            </w:tcMar>
+            <w:vAlign w:val="top"/>
+          </w:tcPr>
+          <w:p>
+            <w:pPr>
+              <w:widowControl w:val="0"/>
+              <w:spacing w:line="240" w:lineRule="auto"/>
+              <w:rPr>
+                <w:sz w:val="16"/>
+                <w:szCs w:val="16"/>
+              </w:rPr>
+            </w:pPr>
+            <w:r>
+              <w:rPr>
+                <w:sz w:val="16"/>
+                <w:szCs w:val="16"/>
+                <w:rtl w:val="0"/>
+              </w:rPr>
+              <w:t xml:space="preserve">0.34454669008250144</w:t>
+            </w:r>
+          </w:p>
+        </w:tc>
+        <w:tc>
+          <w:tcPr>
+            <w:shd w:fill="auto" w:val="clear"/>
+            <w:tcMar>
+              <w:top w:w="100.0" w:type="dxa"/>
+              <w:left w:w="100.0" w:type="dxa"/>
+              <w:bottom w:w="100.0" w:type="dxa"/>
+              <w:right w:w="100.0" w:type="dxa"/>
+            </w:tcMar>
+            <w:vAlign w:val="top"/>
+          </w:tcPr>
+          <w:p>
+            <w:pPr>
+              <w:widowControl w:val="0"/>
+              <w:spacing w:line="240" w:lineRule="auto"/>
+              <w:rPr>
+                <w:sz w:val="16"/>
+                <w:szCs w:val="16"/>
+              </w:rPr>
+            </w:pPr>
+            <w:r>
+              <w:rPr>
+                <w:sz w:val="16"/>
+                <w:szCs w:val="16"/>
+                <w:rtl w:val="0"/>
+              </w:rPr>
+              <w:t xml:space="preserve">0.5780763549596636</w:t>
             </w:r>
           </w:p>
         </w:tc>
@@ -3082,224 +3109,251 @@
             </w:pPr>
             <w:r>
               <w:rPr>
-                <w:rtl w:val="0"/>
-              </w:rPr>
-            </w:r>
-          </w:p>
-        </w:tc>
-        <w:tc>
-          <w:tcPr>
-            <w:shd w:fill="auto" w:val="clear"/>
-            <w:tcMar>
-              <w:top w:w="100.0" w:type="dxa"/>
-              <w:left w:w="100.0" w:type="dxa"/>
-              <w:bottom w:w="100.0" w:type="dxa"/>
-              <w:right w:w="100.0" w:type="dxa"/>
-            </w:tcMar>
-            <w:vAlign w:val="top"/>
-          </w:tcPr>
-          <w:p>
-            <w:pPr>
-              <w:widowControl w:val="0"/>
-              <w:spacing w:line="240" w:lineRule="auto"/>
-              <w:rPr>
-                <w:sz w:val="16"/>
-                <w:szCs w:val="16"/>
-              </w:rPr>
-            </w:pPr>
-            <w:r>
-              <w:rPr>
-                <w:rtl w:val="0"/>
-              </w:rPr>
-            </w:r>
-          </w:p>
-        </w:tc>
-        <w:tc>
-          <w:tcPr>
-            <w:shd w:fill="auto" w:val="clear"/>
-            <w:tcMar>
-              <w:top w:w="100.0" w:type="dxa"/>
-              <w:left w:w="100.0" w:type="dxa"/>
-              <w:bottom w:w="100.0" w:type="dxa"/>
-              <w:right w:w="100.0" w:type="dxa"/>
-            </w:tcMar>
-            <w:vAlign w:val="top"/>
-          </w:tcPr>
-          <w:p>
-            <w:pPr>
-              <w:widowControl w:val="0"/>
-              <w:spacing w:line="240" w:lineRule="auto"/>
-              <w:rPr>
-                <w:sz w:val="16"/>
-                <w:szCs w:val="16"/>
-              </w:rPr>
-            </w:pPr>
-            <w:r>
-              <w:rPr>
-                <w:rtl w:val="0"/>
-              </w:rPr>
-            </w:r>
-          </w:p>
-        </w:tc>
-        <w:tc>
-          <w:tcPr>
-            <w:shd w:fill="auto" w:val="clear"/>
-            <w:tcMar>
-              <w:top w:w="100.0" w:type="dxa"/>
-              <w:left w:w="100.0" w:type="dxa"/>
-              <w:bottom w:w="100.0" w:type="dxa"/>
-              <w:right w:w="100.0" w:type="dxa"/>
-            </w:tcMar>
-            <w:vAlign w:val="top"/>
-          </w:tcPr>
-          <w:p>
-            <w:pPr>
-              <w:widowControl w:val="0"/>
-              <w:spacing w:line="240" w:lineRule="auto"/>
-              <w:rPr>
-                <w:sz w:val="16"/>
-                <w:szCs w:val="16"/>
-              </w:rPr>
-            </w:pPr>
-            <w:r>
-              <w:rPr>
-                <w:rtl w:val="0"/>
-              </w:rPr>
-            </w:r>
-          </w:p>
-        </w:tc>
-        <w:tc>
-          <w:tcPr>
-            <w:shd w:fill="auto" w:val="clear"/>
-            <w:tcMar>
-              <w:top w:w="100.0" w:type="dxa"/>
-              <w:left w:w="100.0" w:type="dxa"/>
-              <w:bottom w:w="100.0" w:type="dxa"/>
-              <w:right w:w="100.0" w:type="dxa"/>
-            </w:tcMar>
-            <w:vAlign w:val="top"/>
-          </w:tcPr>
-          <w:p>
-            <w:pPr>
-              <w:widowControl w:val="0"/>
-              <w:spacing w:line="240" w:lineRule="auto"/>
-              <w:rPr>
-                <w:sz w:val="16"/>
-                <w:szCs w:val="16"/>
-              </w:rPr>
-            </w:pPr>
-            <w:r>
-              <w:rPr>
-                <w:rtl w:val="0"/>
-              </w:rPr>
-            </w:r>
-          </w:p>
-        </w:tc>
-        <w:tc>
-          <w:tcPr>
-            <w:shd w:fill="auto" w:val="clear"/>
-            <w:tcMar>
-              <w:top w:w="100.0" w:type="dxa"/>
-              <w:left w:w="100.0" w:type="dxa"/>
-              <w:bottom w:w="100.0" w:type="dxa"/>
-              <w:right w:w="100.0" w:type="dxa"/>
-            </w:tcMar>
-            <w:vAlign w:val="top"/>
-          </w:tcPr>
-          <w:p>
-            <w:pPr>
-              <w:widowControl w:val="0"/>
-              <w:spacing w:line="240" w:lineRule="auto"/>
-              <w:rPr>
-                <w:sz w:val="16"/>
-                <w:szCs w:val="16"/>
-              </w:rPr>
-            </w:pPr>
-            <w:r>
-              <w:rPr>
-                <w:rtl w:val="0"/>
-              </w:rPr>
-            </w:r>
-          </w:p>
-        </w:tc>
-        <w:tc>
-          <w:tcPr>
-            <w:shd w:fill="auto" w:val="clear"/>
-            <w:tcMar>
-              <w:top w:w="100.0" w:type="dxa"/>
-              <w:left w:w="100.0" w:type="dxa"/>
-              <w:bottom w:w="100.0" w:type="dxa"/>
-              <w:right w:w="100.0" w:type="dxa"/>
-            </w:tcMar>
-            <w:vAlign w:val="top"/>
-          </w:tcPr>
-          <w:p>
-            <w:pPr>
-              <w:widowControl w:val="0"/>
-              <w:spacing w:line="240" w:lineRule="auto"/>
-              <w:rPr>
-                <w:sz w:val="16"/>
-                <w:szCs w:val="16"/>
-              </w:rPr>
-            </w:pPr>
-            <w:r>
-              <w:rPr>
-                <w:rtl w:val="0"/>
-              </w:rPr>
-            </w:r>
-          </w:p>
-        </w:tc>
-        <w:tc>
-          <w:tcPr>
-            <w:shd w:fill="auto" w:val="clear"/>
-            <w:tcMar>
-              <w:top w:w="100.0" w:type="dxa"/>
-              <w:left w:w="100.0" w:type="dxa"/>
-              <w:bottom w:w="100.0" w:type="dxa"/>
-              <w:right w:w="100.0" w:type="dxa"/>
-            </w:tcMar>
-            <w:vAlign w:val="top"/>
-          </w:tcPr>
-          <w:p>
-            <w:pPr>
-              <w:widowControl w:val="0"/>
-              <w:spacing w:line="240" w:lineRule="auto"/>
-              <w:rPr>
-                <w:sz w:val="16"/>
-                <w:szCs w:val="16"/>
-              </w:rPr>
-            </w:pPr>
-            <w:r>
-              <w:rPr>
-                <w:rtl w:val="0"/>
-              </w:rPr>
-            </w:r>
-          </w:p>
-        </w:tc>
-        <w:tc>
-          <w:tcPr>
-            <w:shd w:fill="auto" w:val="clear"/>
-            <w:tcMar>
-              <w:top w:w="100.0" w:type="dxa"/>
-              <w:left w:w="100.0" w:type="dxa"/>
-              <w:bottom w:w="100.0" w:type="dxa"/>
-              <w:right w:w="100.0" w:type="dxa"/>
-            </w:tcMar>
-            <w:vAlign w:val="top"/>
-          </w:tcPr>
-          <w:p>
-            <w:pPr>
-              <w:widowControl w:val="0"/>
-              <w:spacing w:line="240" w:lineRule="auto"/>
-              <w:rPr>
-                <w:sz w:val="16"/>
-                <w:szCs w:val="16"/>
-              </w:rPr>
-            </w:pPr>
-            <w:r>
-              <w:rPr>
-                <w:rtl w:val="0"/>
-              </w:rPr>
+                <w:sz w:val="16"/>
+                <w:szCs w:val="16"/>
+                <w:rtl w:val="0"/>
+              </w:rPr>
+              <w:t xml:space="preserve">0.6527994253989591</w:t>
+            </w:r>
+          </w:p>
+        </w:tc>
+        <w:tc>
+          <w:tcPr>
+            <w:shd w:fill="auto" w:val="clear"/>
+            <w:tcMar>
+              <w:top w:w="100.0" w:type="dxa"/>
+              <w:left w:w="100.0" w:type="dxa"/>
+              <w:bottom w:w="100.0" w:type="dxa"/>
+              <w:right w:w="100.0" w:type="dxa"/>
+            </w:tcMar>
+            <w:vAlign w:val="top"/>
+          </w:tcPr>
+          <w:p>
+            <w:pPr>
+              <w:widowControl w:val="0"/>
+              <w:spacing w:line="240" w:lineRule="auto"/>
+              <w:rPr>
+                <w:sz w:val="16"/>
+                <w:szCs w:val="16"/>
+              </w:rPr>
+            </w:pPr>
+            <w:r>
+              <w:rPr>
+                <w:sz w:val="16"/>
+                <w:szCs w:val="16"/>
+                <w:rtl w:val="0"/>
+              </w:rPr>
+              <w:t xml:space="preserve">0.8244883556810163</w:t>
+            </w:r>
+          </w:p>
+        </w:tc>
+        <w:tc>
+          <w:tcPr>
+            <w:shd w:fill="auto" w:val="clear"/>
+            <w:tcMar>
+              <w:top w:w="100.0" w:type="dxa"/>
+              <w:left w:w="100.0" w:type="dxa"/>
+              <w:bottom w:w="100.0" w:type="dxa"/>
+              <w:right w:w="100.0" w:type="dxa"/>
+            </w:tcMar>
+            <w:vAlign w:val="top"/>
+          </w:tcPr>
+          <w:p>
+            <w:pPr>
+              <w:widowControl w:val="0"/>
+              <w:spacing w:line="240" w:lineRule="auto"/>
+              <w:rPr>
+                <w:sz w:val="16"/>
+                <w:szCs w:val="16"/>
+              </w:rPr>
+            </w:pPr>
+            <w:r>
+              <w:rPr>
+                <w:sz w:val="16"/>
+                <w:szCs w:val="16"/>
+                <w:rtl w:val="0"/>
+              </w:rPr>
+              <w:t xml:space="preserve">0.7168313338038109</w:t>
+            </w:r>
+          </w:p>
+        </w:tc>
+        <w:tc>
+          <w:tcPr>
+            <w:shd w:fill="auto" w:val="clear"/>
+            <w:tcMar>
+              <w:top w:w="100.0" w:type="dxa"/>
+              <w:left w:w="100.0" w:type="dxa"/>
+              <w:bottom w:w="100.0" w:type="dxa"/>
+              <w:right w:w="100.0" w:type="dxa"/>
+            </w:tcMar>
+            <w:vAlign w:val="top"/>
+          </w:tcPr>
+          <w:p>
+            <w:pPr>
+              <w:widowControl w:val="0"/>
+              <w:spacing w:line="240" w:lineRule="auto"/>
+              <w:rPr>
+                <w:sz w:val="16"/>
+                <w:szCs w:val="16"/>
+              </w:rPr>
+            </w:pPr>
+            <w:r>
+              <w:rPr>
+                <w:sz w:val="16"/>
+                <w:szCs w:val="16"/>
+                <w:rtl w:val="0"/>
+              </w:rPr>
+              <w:t xml:space="preserve">0.2630178579843836</w:t>
+            </w:r>
+          </w:p>
+        </w:tc>
+        <w:tc>
+          <w:tcPr>
+            <w:shd w:fill="auto" w:val="clear"/>
+            <w:tcMar>
+              <w:top w:w="100.0" w:type="dxa"/>
+              <w:left w:w="100.0" w:type="dxa"/>
+              <w:bottom w:w="100.0" w:type="dxa"/>
+              <w:right w:w="100.0" w:type="dxa"/>
+            </w:tcMar>
+            <w:vAlign w:val="top"/>
+          </w:tcPr>
+          <w:p>
+            <w:pPr>
+              <w:widowControl w:val="0"/>
+              <w:spacing w:line="240" w:lineRule="auto"/>
+              <w:rPr>
+                <w:sz w:val="16"/>
+                <w:szCs w:val="16"/>
+              </w:rPr>
+            </w:pPr>
+            <w:r>
+              <w:rPr>
+                <w:sz w:val="16"/>
+                <w:szCs w:val="16"/>
+                <w:rtl w:val="0"/>
+              </w:rPr>
+              <w:t xml:space="preserve">0.44333200466841677</w:t>
+            </w:r>
+          </w:p>
+        </w:tc>
+        <w:tc>
+          <w:tcPr>
+            <w:shd w:fill="auto" w:val="clear"/>
+            <w:tcMar>
+              <w:top w:w="100.0" w:type="dxa"/>
+              <w:left w:w="100.0" w:type="dxa"/>
+              <w:bottom w:w="100.0" w:type="dxa"/>
+              <w:right w:w="100.0" w:type="dxa"/>
+            </w:tcMar>
+            <w:vAlign w:val="top"/>
+          </w:tcPr>
+          <w:p>
+            <w:pPr>
+              <w:widowControl w:val="0"/>
+              <w:spacing w:line="240" w:lineRule="auto"/>
+              <w:rPr>
+                <w:sz w:val="16"/>
+                <w:szCs w:val="16"/>
+              </w:rPr>
+            </w:pPr>
+            <w:r>
+              <w:rPr>
+                <w:sz w:val="16"/>
+                <w:szCs w:val="16"/>
+                <w:rtl w:val="0"/>
+              </w:rPr>
+              <w:t xml:space="preserve">0.20470651404516693</w:t>
+            </w:r>
+          </w:p>
+        </w:tc>
+        <w:tc>
+          <w:tcPr>
+            <w:shd w:fill="auto" w:val="clear"/>
+            <w:tcMar>
+              <w:top w:w="100.0" w:type="dxa"/>
+              <w:left w:w="100.0" w:type="dxa"/>
+              <w:bottom w:w="100.0" w:type="dxa"/>
+              <w:right w:w="100.0" w:type="dxa"/>
+            </w:tcMar>
+            <w:vAlign w:val="top"/>
+          </w:tcPr>
+          <w:p>
+            <w:pPr>
+              <w:widowControl w:val="0"/>
+              <w:spacing w:line="240" w:lineRule="auto"/>
+              <w:rPr>
+                <w:sz w:val="16"/>
+                <w:szCs w:val="16"/>
+              </w:rPr>
+            </w:pPr>
+            <w:r>
+              <w:rPr>
+                <w:sz w:val="16"/>
+                <w:szCs w:val="16"/>
+                <w:rtl w:val="0"/>
+              </w:rPr>
+              <w:t xml:space="preserve">0.6521749833829793</w:t>
+            </w:r>
+          </w:p>
+        </w:tc>
+        <w:tc>
+          <w:tcPr>
+            <w:shd w:fill="auto" w:val="clear"/>
+            <w:tcMar>
+              <w:top w:w="100.0" w:type="dxa"/>
+              <w:left w:w="100.0" w:type="dxa"/>
+              <w:bottom w:w="100.0" w:type="dxa"/>
+              <w:right w:w="100.0" w:type="dxa"/>
+            </w:tcMar>
+            <w:vAlign w:val="top"/>
+          </w:tcPr>
+          <w:p>
+            <w:pPr>
+              <w:widowControl w:val="0"/>
+              <w:spacing w:line="240" w:lineRule="auto"/>
+              <w:rPr>
+                <w:sz w:val="16"/>
+                <w:szCs w:val="16"/>
+              </w:rPr>
+            </w:pPr>
+            <w:r>
+              <w:rPr>
+                <w:sz w:val="16"/>
+                <w:szCs w:val="16"/>
+                <w:rtl w:val="0"/>
+              </w:rPr>
+              <w:t xml:space="preserve">0.34454669008250144</w:t>
+            </w:r>
+          </w:p>
+        </w:tc>
+        <w:tc>
+          <w:tcPr>
+            <w:shd w:fill="auto" w:val="clear"/>
+            <w:tcMar>
+              <w:top w:w="100.0" w:type="dxa"/>
+              <w:left w:w="100.0" w:type="dxa"/>
+              <w:bottom w:w="100.0" w:type="dxa"/>
+              <w:right w:w="100.0" w:type="dxa"/>
+            </w:tcMar>
+            <w:vAlign w:val="top"/>
+          </w:tcPr>
+          <w:p>
+            <w:pPr>
+              <w:widowControl w:val="0"/>
+              <w:spacing w:line="240" w:lineRule="auto"/>
+              <w:rPr>
+                <w:sz w:val="16"/>
+                <w:szCs w:val="16"/>
+              </w:rPr>
+            </w:pPr>
+            <w:r>
+              <w:rPr>
+                <w:sz w:val="16"/>
+                <w:szCs w:val="16"/>
+                <w:rtl w:val="0"/>
+              </w:rPr>
+              <w:t xml:space="preserve">0.5780763549596636</w:t>
             </w:r>
           </w:p>
         </w:tc>
@@ -5580,89 +5634,101 @@
             </w:pPr>
             <w:r>
               <w:rPr>
-                <w:rtl w:val="0"/>
-              </w:rPr>
-            </w:r>
-          </w:p>
-        </w:tc>
-        <w:tc>
-          <w:tcPr>
-            <w:shd w:fill="auto" w:val="clear"/>
-            <w:tcMar>
-              <w:top w:w="100.0" w:type="dxa"/>
-              <w:left w:w="100.0" w:type="dxa"/>
-              <w:bottom w:w="100.0" w:type="dxa"/>
-              <w:right w:w="100.0" w:type="dxa"/>
-            </w:tcMar>
-            <w:vAlign w:val="top"/>
-          </w:tcPr>
-          <w:p>
-            <w:pPr>
-              <w:widowControl w:val="0"/>
-              <w:spacing w:line="240" w:lineRule="auto"/>
-              <w:rPr>
-                <w:sz w:val="16"/>
-                <w:szCs w:val="16"/>
-              </w:rPr>
-            </w:pPr>
-            <w:r>
-              <w:rPr>
-                <w:rtl w:val="0"/>
-              </w:rPr>
-            </w:r>
-          </w:p>
-        </w:tc>
-        <w:tc>
-          <w:tcPr>
-            <w:shd w:fill="auto" w:val="clear"/>
-            <w:tcMar>
-              <w:top w:w="100.0" w:type="dxa"/>
-              <w:left w:w="100.0" w:type="dxa"/>
-              <w:bottom w:w="100.0" w:type="dxa"/>
-              <w:right w:w="100.0" w:type="dxa"/>
-            </w:tcMar>
-            <w:vAlign w:val="top"/>
-          </w:tcPr>
-          <w:p>
-            <w:pPr>
-              <w:widowControl w:val="0"/>
-              <w:spacing w:line="240" w:lineRule="auto"/>
-              <w:rPr>
-                <w:sz w:val="16"/>
-                <w:szCs w:val="16"/>
-              </w:rPr>
-            </w:pPr>
-            <w:r>
-              <w:rPr>
-                <w:rtl w:val="0"/>
-              </w:rPr>
-            </w:r>
-          </w:p>
-        </w:tc>
-        <w:tc>
-          <w:tcPr>
-            <w:shd w:fill="auto" w:val="clear"/>
-            <w:tcMar>
-              <w:top w:w="100.0" w:type="dxa"/>
-              <w:left w:w="100.0" w:type="dxa"/>
-              <w:bottom w:w="100.0" w:type="dxa"/>
-              <w:right w:w="100.0" w:type="dxa"/>
-            </w:tcMar>
-            <w:vAlign w:val="top"/>
-          </w:tcPr>
-          <w:p>
-            <w:pPr>
-              <w:widowControl w:val="0"/>
-              <w:spacing w:line="240" w:lineRule="auto"/>
-              <w:rPr>
-                <w:sz w:val="16"/>
-                <w:szCs w:val="16"/>
-              </w:rPr>
-            </w:pPr>
-            <w:r>
-              <w:rPr>
-                <w:rtl w:val="0"/>
-              </w:rPr>
+                <w:sz w:val="16"/>
+                <w:szCs w:val="16"/>
+                <w:rtl w:val="0"/>
+              </w:rPr>
+              <w:t xml:space="preserve">0.20470651404516693</w:t>
+            </w:r>
+          </w:p>
+        </w:tc>
+        <w:tc>
+          <w:tcPr>
+            <w:shd w:fill="auto" w:val="clear"/>
+            <w:tcMar>
+              <w:top w:w="100.0" w:type="dxa"/>
+              <w:left w:w="100.0" w:type="dxa"/>
+              <w:bottom w:w="100.0" w:type="dxa"/>
+              <w:right w:w="100.0" w:type="dxa"/>
+            </w:tcMar>
+            <w:vAlign w:val="top"/>
+          </w:tcPr>
+          <w:p>
+            <w:pPr>
+              <w:widowControl w:val="0"/>
+              <w:spacing w:line="240" w:lineRule="auto"/>
+              <w:rPr>
+                <w:sz w:val="16"/>
+                <w:szCs w:val="16"/>
+              </w:rPr>
+            </w:pPr>
+            <w:r>
+              <w:rPr>
+                <w:sz w:val="16"/>
+                <w:szCs w:val="16"/>
+                <w:rtl w:val="0"/>
+              </w:rPr>
+              <w:t xml:space="preserve">0.6521749833829793</w:t>
+            </w:r>
+          </w:p>
+        </w:tc>
+        <w:tc>
+          <w:tcPr>
+            <w:shd w:fill="auto" w:val="clear"/>
+            <w:tcMar>
+              <w:top w:w="100.0" w:type="dxa"/>
+              <w:left w:w="100.0" w:type="dxa"/>
+              <w:bottom w:w="100.0" w:type="dxa"/>
+              <w:right w:w="100.0" w:type="dxa"/>
+            </w:tcMar>
+            <w:vAlign w:val="top"/>
+          </w:tcPr>
+          <w:p>
+            <w:pPr>
+              <w:widowControl w:val="0"/>
+              <w:spacing w:line="240" w:lineRule="auto"/>
+              <w:rPr>
+                <w:sz w:val="16"/>
+                <w:szCs w:val="16"/>
+              </w:rPr>
+            </w:pPr>
+            <w:r>
+              <w:rPr>
+                <w:sz w:val="16"/>
+                <w:szCs w:val="16"/>
+                <w:rtl w:val="0"/>
+              </w:rPr>
+              <w:t xml:space="preserve">0.34454669008250144</w:t>
+            </w:r>
+          </w:p>
+        </w:tc>
+        <w:tc>
+          <w:tcPr>
+            <w:shd w:fill="auto" w:val="clear"/>
+            <w:tcMar>
+              <w:top w:w="100.0" w:type="dxa"/>
+              <w:left w:w="100.0" w:type="dxa"/>
+              <w:bottom w:w="100.0" w:type="dxa"/>
+              <w:right w:w="100.0" w:type="dxa"/>
+            </w:tcMar>
+            <w:vAlign w:val="top"/>
+          </w:tcPr>
+          <w:p>
+            <w:pPr>
+              <w:widowControl w:val="0"/>
+              <w:spacing w:line="240" w:lineRule="auto"/>
+              <w:rPr>
+                <w:sz w:val="16"/>
+                <w:szCs w:val="16"/>
+              </w:rPr>
+            </w:pPr>
+            <w:r>
+              <w:rPr>
+                <w:sz w:val="16"/>
+                <w:szCs w:val="16"/>
+                <w:rtl w:val="0"/>
+              </w:rPr>
+              <w:t xml:space="preserve">0.5780763549596636</w:t>
             </w:r>
           </w:p>
         </w:tc>

</xml_diff>

<commit_message>
All but the Drug Reccomendations Filled
</commit_message>
<xml_diff>
--- a/Tables_to_Fill.docx
+++ b/Tables_to_Fill.docx
@@ -1430,89 +1430,101 @@
             </w:pPr>
             <w:r>
               <w:rPr>
-                <w:rtl w:val="0"/>
-              </w:rPr>
-            </w:r>
-          </w:p>
-        </w:tc>
-        <w:tc>
-          <w:tcPr>
-            <w:shd w:fill="auto" w:val="clear"/>
-            <w:tcMar>
-              <w:top w:w="100.0" w:type="dxa"/>
-              <w:left w:w="100.0" w:type="dxa"/>
-              <w:bottom w:w="100.0" w:type="dxa"/>
-              <w:right w:w="100.0" w:type="dxa"/>
-            </w:tcMar>
-            <w:vAlign w:val="top"/>
-          </w:tcPr>
-          <w:p>
-            <w:pPr>
-              <w:widowControl w:val="0"/>
-              <w:spacing w:line="240" w:lineRule="auto"/>
-              <w:rPr>
-                <w:sz w:val="16"/>
-                <w:szCs w:val="16"/>
-              </w:rPr>
-            </w:pPr>
-            <w:r>
-              <w:rPr>
-                <w:rtl w:val="0"/>
-              </w:rPr>
-            </w:r>
-          </w:p>
-        </w:tc>
-        <w:tc>
-          <w:tcPr>
-            <w:shd w:fill="auto" w:val="clear"/>
-            <w:tcMar>
-              <w:top w:w="100.0" w:type="dxa"/>
-              <w:left w:w="100.0" w:type="dxa"/>
-              <w:bottom w:w="100.0" w:type="dxa"/>
-              <w:right w:w="100.0" w:type="dxa"/>
-            </w:tcMar>
-            <w:vAlign w:val="top"/>
-          </w:tcPr>
-          <w:p>
-            <w:pPr>
-              <w:widowControl w:val="0"/>
-              <w:spacing w:line="240" w:lineRule="auto"/>
-              <w:rPr>
-                <w:sz w:val="16"/>
-                <w:szCs w:val="16"/>
-              </w:rPr>
-            </w:pPr>
-            <w:r>
-              <w:rPr>
-                <w:rtl w:val="0"/>
-              </w:rPr>
-            </w:r>
-          </w:p>
-        </w:tc>
-        <w:tc>
-          <w:tcPr>
-            <w:shd w:fill="auto" w:val="clear"/>
-            <w:tcMar>
-              <w:top w:w="100.0" w:type="dxa"/>
-              <w:left w:w="100.0" w:type="dxa"/>
-              <w:bottom w:w="100.0" w:type="dxa"/>
-              <w:right w:w="100.0" w:type="dxa"/>
-            </w:tcMar>
-            <w:vAlign w:val="top"/>
-          </w:tcPr>
-          <w:p>
-            <w:pPr>
-              <w:widowControl w:val="0"/>
-              <w:spacing w:line="240" w:lineRule="auto"/>
-              <w:rPr>
-                <w:sz w:val="16"/>
-                <w:szCs w:val="16"/>
-              </w:rPr>
-            </w:pPr>
-            <w:r>
-              <w:rPr>
-                <w:rtl w:val="0"/>
-              </w:rPr>
+                <w:sz w:val="16"/>
+                <w:szCs w:val="16"/>
+                <w:rtl w:val="0"/>
+              </w:rPr>
+              <w:t xml:space="preserve">0.1501936075860243</w:t>
+            </w:r>
+          </w:p>
+        </w:tc>
+        <w:tc>
+          <w:tcPr>
+            <w:shd w:fill="auto" w:val="clear"/>
+            <w:tcMar>
+              <w:top w:w="100.0" w:type="dxa"/>
+              <w:left w:w="100.0" w:type="dxa"/>
+              <w:bottom w:w="100.0" w:type="dxa"/>
+              <w:right w:w="100.0" w:type="dxa"/>
+            </w:tcMar>
+            <w:vAlign w:val="top"/>
+          </w:tcPr>
+          <w:p>
+            <w:pPr>
+              <w:widowControl w:val="0"/>
+              <w:spacing w:line="240" w:lineRule="auto"/>
+              <w:rPr>
+                <w:sz w:val="16"/>
+                <w:szCs w:val="16"/>
+              </w:rPr>
+            </w:pPr>
+            <w:r>
+              <w:rPr>
+                <w:sz w:val="16"/>
+                <w:szCs w:val="16"/>
+                <w:rtl w:val="0"/>
+              </w:rPr>
+              <w:t xml:space="preserve">0.6161591295142905</w:t>
+            </w:r>
+          </w:p>
+        </w:tc>
+        <w:tc>
+          <w:tcPr>
+            <w:shd w:fill="auto" w:val="clear"/>
+            <w:tcMar>
+              <w:top w:w="100.0" w:type="dxa"/>
+              <w:left w:w="100.0" w:type="dxa"/>
+              <w:bottom w:w="100.0" w:type="dxa"/>
+              <w:right w:w="100.0" w:type="dxa"/>
+            </w:tcMar>
+            <w:vAlign w:val="top"/>
+          </w:tcPr>
+          <w:p>
+            <w:pPr>
+              <w:widowControl w:val="0"/>
+              <w:spacing w:line="240" w:lineRule="auto"/>
+              <w:rPr>
+                <w:sz w:val="16"/>
+                <w:szCs w:val="16"/>
+              </w:rPr>
+            </w:pPr>
+            <w:r>
+              <w:rPr>
+                <w:sz w:val="16"/>
+                <w:szCs w:val="16"/>
+                <w:rtl w:val="0"/>
+              </w:rPr>
+              <w:t xml:space="preserve">0.3657651702799499</w:t>
+            </w:r>
+          </w:p>
+        </w:tc>
+        <w:tc>
+          <w:tcPr>
+            <w:shd w:fill="auto" w:val="clear"/>
+            <w:tcMar>
+              <w:top w:w="100.0" w:type="dxa"/>
+              <w:left w:w="100.0" w:type="dxa"/>
+              <w:bottom w:w="100.0" w:type="dxa"/>
+              <w:right w:w="100.0" w:type="dxa"/>
+            </w:tcMar>
+            <w:vAlign w:val="top"/>
+          </w:tcPr>
+          <w:p>
+            <w:pPr>
+              <w:widowControl w:val="0"/>
+              <w:spacing w:line="240" w:lineRule="auto"/>
+              <w:rPr>
+                <w:sz w:val="16"/>
+                <w:szCs w:val="16"/>
+              </w:rPr>
+            </w:pPr>
+            <w:r>
+              <w:rPr>
+                <w:sz w:val="16"/>
+                <w:szCs w:val="16"/>
+                <w:rtl w:val="0"/>
+              </w:rPr>
+              <w:t xml:space="preserve">0.5785791387342347</w:t>
             </w:r>
           </w:p>
         </w:tc>
@@ -1729,89 +1741,101 @@
             </w:pPr>
             <w:r>
               <w:rPr>
-                <w:rtl w:val="0"/>
-              </w:rPr>
-            </w:r>
-          </w:p>
-        </w:tc>
-        <w:tc>
-          <w:tcPr>
-            <w:shd w:fill="auto" w:val="clear"/>
-            <w:tcMar>
-              <w:top w:w="100.0" w:type="dxa"/>
-              <w:left w:w="100.0" w:type="dxa"/>
-              <w:bottom w:w="100.0" w:type="dxa"/>
-              <w:right w:w="100.0" w:type="dxa"/>
-            </w:tcMar>
-            <w:vAlign w:val="top"/>
-          </w:tcPr>
-          <w:p>
-            <w:pPr>
-              <w:widowControl w:val="0"/>
-              <w:spacing w:line="240" w:lineRule="auto"/>
-              <w:rPr>
-                <w:sz w:val="16"/>
-                <w:szCs w:val="16"/>
-              </w:rPr>
-            </w:pPr>
-            <w:r>
-              <w:rPr>
-                <w:rtl w:val="0"/>
-              </w:rPr>
-            </w:r>
-          </w:p>
-        </w:tc>
-        <w:tc>
-          <w:tcPr>
-            <w:shd w:fill="auto" w:val="clear"/>
-            <w:tcMar>
-              <w:top w:w="100.0" w:type="dxa"/>
-              <w:left w:w="100.0" w:type="dxa"/>
-              <w:bottom w:w="100.0" w:type="dxa"/>
-              <w:right w:w="100.0" w:type="dxa"/>
-            </w:tcMar>
-            <w:vAlign w:val="top"/>
-          </w:tcPr>
-          <w:p>
-            <w:pPr>
-              <w:widowControl w:val="0"/>
-              <w:spacing w:line="240" w:lineRule="auto"/>
-              <w:rPr>
-                <w:sz w:val="16"/>
-                <w:szCs w:val="16"/>
-              </w:rPr>
-            </w:pPr>
-            <w:r>
-              <w:rPr>
-                <w:rtl w:val="0"/>
-              </w:rPr>
-            </w:r>
-          </w:p>
-        </w:tc>
-        <w:tc>
-          <w:tcPr>
-            <w:shd w:fill="auto" w:val="clear"/>
-            <w:tcMar>
-              <w:top w:w="100.0" w:type="dxa"/>
-              <w:left w:w="100.0" w:type="dxa"/>
-              <w:bottom w:w="100.0" w:type="dxa"/>
-              <w:right w:w="100.0" w:type="dxa"/>
-            </w:tcMar>
-            <w:vAlign w:val="top"/>
-          </w:tcPr>
-          <w:p>
-            <w:pPr>
-              <w:widowControl w:val="0"/>
-              <w:spacing w:line="240" w:lineRule="auto"/>
-              <w:rPr>
-                <w:sz w:val="16"/>
-                <w:szCs w:val="16"/>
-              </w:rPr>
-            </w:pPr>
-            <w:r>
-              <w:rPr>
-                <w:rtl w:val="0"/>
-              </w:rPr>
+                <w:sz w:val="16"/>
+                <w:szCs w:val="16"/>
+                <w:rtl w:val="0"/>
+              </w:rPr>
+              <w:t xml:space="preserve">0.18414804661161283</w:t>
+            </w:r>
+          </w:p>
+        </w:tc>
+        <w:tc>
+          <w:tcPr>
+            <w:shd w:fill="auto" w:val="clear"/>
+            <w:tcMar>
+              <w:top w:w="100.0" w:type="dxa"/>
+              <w:left w:w="100.0" w:type="dxa"/>
+              <w:bottom w:w="100.0" w:type="dxa"/>
+              <w:right w:w="100.0" w:type="dxa"/>
+            </w:tcMar>
+            <w:vAlign w:val="top"/>
+          </w:tcPr>
+          <w:p>
+            <w:pPr>
+              <w:widowControl w:val="0"/>
+              <w:spacing w:line="240" w:lineRule="auto"/>
+              <w:rPr>
+                <w:sz w:val="16"/>
+                <w:szCs w:val="16"/>
+              </w:rPr>
+            </w:pPr>
+            <w:r>
+              <w:rPr>
+                <w:sz w:val="16"/>
+                <w:szCs w:val="16"/>
+                <w:rtl w:val="0"/>
+              </w:rPr>
+              <w:t xml:space="preserve">0.5984712340907412</w:t>
+            </w:r>
+          </w:p>
+        </w:tc>
+        <w:tc>
+          <w:tcPr>
+            <w:shd w:fill="auto" w:val="clear"/>
+            <w:tcMar>
+              <w:top w:w="100.0" w:type="dxa"/>
+              <w:left w:w="100.0" w:type="dxa"/>
+              <w:bottom w:w="100.0" w:type="dxa"/>
+              <w:right w:w="100.0" w:type="dxa"/>
+            </w:tcMar>
+            <w:vAlign w:val="top"/>
+          </w:tcPr>
+          <w:p>
+            <w:pPr>
+              <w:widowControl w:val="0"/>
+              <w:spacing w:line="240" w:lineRule="auto"/>
+              <w:rPr>
+                <w:sz w:val="16"/>
+                <w:szCs w:val="16"/>
+              </w:rPr>
+            </w:pPr>
+            <w:r>
+              <w:rPr>
+                <w:sz w:val="16"/>
+                <w:szCs w:val="16"/>
+                <w:rtl w:val="0"/>
+              </w:rPr>
+              <w:t xml:space="preserve">0.3700682807886904</w:t>
+            </w:r>
+          </w:p>
+        </w:tc>
+        <w:tc>
+          <w:tcPr>
+            <w:shd w:fill="auto" w:val="clear"/>
+            <w:tcMar>
+              <w:top w:w="100.0" w:type="dxa"/>
+              <w:left w:w="100.0" w:type="dxa"/>
+              <w:bottom w:w="100.0" w:type="dxa"/>
+              <w:right w:w="100.0" w:type="dxa"/>
+            </w:tcMar>
+            <w:vAlign w:val="top"/>
+          </w:tcPr>
+          <w:p>
+            <w:pPr>
+              <w:widowControl w:val="0"/>
+              <w:spacing w:line="240" w:lineRule="auto"/>
+              <w:rPr>
+                <w:sz w:val="16"/>
+                <w:szCs w:val="16"/>
+              </w:rPr>
+            </w:pPr>
+            <w:r>
+              <w:rPr>
+                <w:sz w:val="16"/>
+                <w:szCs w:val="16"/>
+                <w:rtl w:val="0"/>
+              </w:rPr>
+              <w:t xml:space="preserve">0.5928019543233722</w:t>
             </w:r>
           </w:p>
         </w:tc>
@@ -2009,89 +2033,101 @@
             </w:pPr>
             <w:r>
               <w:rPr>
-                <w:rtl w:val="0"/>
-              </w:rPr>
-            </w:r>
-          </w:p>
-        </w:tc>
-        <w:tc>
-          <w:tcPr>
-            <w:shd w:fill="auto" w:val="clear"/>
-            <w:tcMar>
-              <w:top w:w="100.0" w:type="dxa"/>
-              <w:left w:w="100.0" w:type="dxa"/>
-              <w:bottom w:w="100.0" w:type="dxa"/>
-              <w:right w:w="100.0" w:type="dxa"/>
-            </w:tcMar>
-            <w:vAlign w:val="top"/>
-          </w:tcPr>
-          <w:p>
-            <w:pPr>
-              <w:widowControl w:val="0"/>
-              <w:spacing w:line="240" w:lineRule="auto"/>
-              <w:rPr>
-                <w:sz w:val="16"/>
-                <w:szCs w:val="16"/>
-              </w:rPr>
-            </w:pPr>
-            <w:r>
-              <w:rPr>
-                <w:rtl w:val="0"/>
-              </w:rPr>
-            </w:r>
-          </w:p>
-        </w:tc>
-        <w:tc>
-          <w:tcPr>
-            <w:shd w:fill="auto" w:val="clear"/>
-            <w:tcMar>
-              <w:top w:w="100.0" w:type="dxa"/>
-              <w:left w:w="100.0" w:type="dxa"/>
-              <w:bottom w:w="100.0" w:type="dxa"/>
-              <w:right w:w="100.0" w:type="dxa"/>
-            </w:tcMar>
-            <w:vAlign w:val="top"/>
-          </w:tcPr>
-          <w:p>
-            <w:pPr>
-              <w:widowControl w:val="0"/>
-              <w:spacing w:line="240" w:lineRule="auto"/>
-              <w:rPr>
-                <w:sz w:val="16"/>
-                <w:szCs w:val="16"/>
-              </w:rPr>
-            </w:pPr>
-            <w:r>
-              <w:rPr>
-                <w:rtl w:val="0"/>
-              </w:rPr>
-            </w:r>
-          </w:p>
-        </w:tc>
-        <w:tc>
-          <w:tcPr>
-            <w:shd w:fill="auto" w:val="clear"/>
-            <w:tcMar>
-              <w:top w:w="100.0" w:type="dxa"/>
-              <w:left w:w="100.0" w:type="dxa"/>
-              <w:bottom w:w="100.0" w:type="dxa"/>
-              <w:right w:w="100.0" w:type="dxa"/>
-            </w:tcMar>
-            <w:vAlign w:val="top"/>
-          </w:tcPr>
-          <w:p>
-            <w:pPr>
-              <w:widowControl w:val="0"/>
-              <w:spacing w:line="240" w:lineRule="auto"/>
-              <w:rPr>
-                <w:sz w:val="16"/>
-                <w:szCs w:val="16"/>
-              </w:rPr>
-            </w:pPr>
-            <w:r>
-              <w:rPr>
-                <w:rtl w:val="0"/>
-              </w:rPr>
+                <w:sz w:val="16"/>
+                <w:szCs w:val="16"/>
+                <w:rtl w:val="0"/>
+              </w:rPr>
+              <w:t xml:space="preserve">0.20787679687675675</w:t>
+            </w:r>
+          </w:p>
+        </w:tc>
+        <w:tc>
+          <w:tcPr>
+            <w:shd w:fill="auto" w:val="clear"/>
+            <w:tcMar>
+              <w:top w:w="100.0" w:type="dxa"/>
+              <w:left w:w="100.0" w:type="dxa"/>
+              <w:bottom w:w="100.0" w:type="dxa"/>
+              <w:right w:w="100.0" w:type="dxa"/>
+            </w:tcMar>
+            <w:vAlign w:val="top"/>
+          </w:tcPr>
+          <w:p>
+            <w:pPr>
+              <w:widowControl w:val="0"/>
+              <w:spacing w:line="240" w:lineRule="auto"/>
+              <w:rPr>
+                <w:sz w:val="16"/>
+                <w:szCs w:val="16"/>
+              </w:rPr>
+            </w:pPr>
+            <w:r>
+              <w:rPr>
+                <w:sz w:val="16"/>
+                <w:szCs w:val="16"/>
+                <w:rtl w:val="0"/>
+              </w:rPr>
+              <w:t xml:space="preserve">0.6646069766869354</w:t>
+            </w:r>
+          </w:p>
+        </w:tc>
+        <w:tc>
+          <w:tcPr>
+            <w:shd w:fill="auto" w:val="clear"/>
+            <w:tcMar>
+              <w:top w:w="100.0" w:type="dxa"/>
+              <w:left w:w="100.0" w:type="dxa"/>
+              <w:bottom w:w="100.0" w:type="dxa"/>
+              <w:right w:w="100.0" w:type="dxa"/>
+            </w:tcMar>
+            <w:vAlign w:val="top"/>
+          </w:tcPr>
+          <w:p>
+            <w:pPr>
+              <w:widowControl w:val="0"/>
+              <w:spacing w:line="240" w:lineRule="auto"/>
+              <w:rPr>
+                <w:sz w:val="16"/>
+                <w:szCs w:val="16"/>
+              </w:rPr>
+            </w:pPr>
+            <w:r>
+              <w:rPr>
+                <w:sz w:val="16"/>
+                <w:szCs w:val="16"/>
+                <w:rtl w:val="0"/>
+              </w:rPr>
+              <w:t xml:space="preserve">0.379196039050761</w:t>
+            </w:r>
+          </w:p>
+        </w:tc>
+        <w:tc>
+          <w:tcPr>
+            <w:shd w:fill="auto" w:val="clear"/>
+            <w:tcMar>
+              <w:top w:w="100.0" w:type="dxa"/>
+              <w:left w:w="100.0" w:type="dxa"/>
+              <w:bottom w:w="100.0" w:type="dxa"/>
+              <w:right w:w="100.0" w:type="dxa"/>
+            </w:tcMar>
+            <w:vAlign w:val="top"/>
+          </w:tcPr>
+          <w:p>
+            <w:pPr>
+              <w:widowControl w:val="0"/>
+              <w:spacing w:line="240" w:lineRule="auto"/>
+              <w:rPr>
+                <w:sz w:val="16"/>
+                <w:szCs w:val="16"/>
+              </w:rPr>
+            </w:pPr>
+            <w:r>
+              <w:rPr>
+                <w:sz w:val="16"/>
+                <w:szCs w:val="16"/>
+                <w:rtl w:val="0"/>
+              </w:rPr>
+              <w:t xml:space="preserve">0.6028576298147938</w:t>
             </w:r>
           </w:p>
         </w:tc>
@@ -3551,89 +3587,101 @@
             </w:pPr>
             <w:r>
               <w:rPr>
-                <w:rtl w:val="0"/>
-              </w:rPr>
-            </w:r>
-          </w:p>
-        </w:tc>
-        <w:tc>
-          <w:tcPr>
-            <w:shd w:fill="auto" w:val="clear"/>
-            <w:tcMar>
-              <w:top w:w="100.0" w:type="dxa"/>
-              <w:left w:w="100.0" w:type="dxa"/>
-              <w:bottom w:w="100.0" w:type="dxa"/>
-              <w:right w:w="100.0" w:type="dxa"/>
-            </w:tcMar>
-            <w:vAlign w:val="top"/>
-          </w:tcPr>
-          <w:p>
-            <w:pPr>
-              <w:widowControl w:val="0"/>
-              <w:spacing w:line="240" w:lineRule="auto"/>
-              <w:rPr>
-                <w:sz w:val="16"/>
-                <w:szCs w:val="16"/>
-              </w:rPr>
-            </w:pPr>
-            <w:r>
-              <w:rPr>
-                <w:rtl w:val="0"/>
-              </w:rPr>
-            </w:r>
-          </w:p>
-        </w:tc>
-        <w:tc>
-          <w:tcPr>
-            <w:shd w:fill="auto" w:val="clear"/>
-            <w:tcMar>
-              <w:top w:w="100.0" w:type="dxa"/>
-              <w:left w:w="100.0" w:type="dxa"/>
-              <w:bottom w:w="100.0" w:type="dxa"/>
-              <w:right w:w="100.0" w:type="dxa"/>
-            </w:tcMar>
-            <w:vAlign w:val="top"/>
-          </w:tcPr>
-          <w:p>
-            <w:pPr>
-              <w:widowControl w:val="0"/>
-              <w:spacing w:line="240" w:lineRule="auto"/>
-              <w:rPr>
-                <w:sz w:val="16"/>
-                <w:szCs w:val="16"/>
-              </w:rPr>
-            </w:pPr>
-            <w:r>
-              <w:rPr>
-                <w:rtl w:val="0"/>
-              </w:rPr>
-            </w:r>
-          </w:p>
-        </w:tc>
-        <w:tc>
-          <w:tcPr>
-            <w:shd w:fill="auto" w:val="clear"/>
-            <w:tcMar>
-              <w:top w:w="100.0" w:type="dxa"/>
-              <w:left w:w="100.0" w:type="dxa"/>
-              <w:bottom w:w="100.0" w:type="dxa"/>
-              <w:right w:w="100.0" w:type="dxa"/>
-            </w:tcMar>
-            <w:vAlign w:val="top"/>
-          </w:tcPr>
-          <w:p>
-            <w:pPr>
-              <w:widowControl w:val="0"/>
-              <w:spacing w:line="240" w:lineRule="auto"/>
-              <w:rPr>
-                <w:sz w:val="16"/>
-                <w:szCs w:val="16"/>
-              </w:rPr>
-            </w:pPr>
-            <w:r>
-              <w:rPr>
-                <w:rtl w:val="0"/>
-              </w:rPr>
+                <w:sz w:val="16"/>
+                <w:szCs w:val="16"/>
+                <w:rtl w:val="0"/>
+              </w:rPr>
+              <w:t xml:space="preserve">0.1912244210275994</w:t>
+            </w:r>
+          </w:p>
+        </w:tc>
+        <w:tc>
+          <w:tcPr>
+            <w:shd w:fill="auto" w:val="clear"/>
+            <w:tcMar>
+              <w:top w:w="100.0" w:type="dxa"/>
+              <w:left w:w="100.0" w:type="dxa"/>
+              <w:bottom w:w="100.0" w:type="dxa"/>
+              <w:right w:w="100.0" w:type="dxa"/>
+            </w:tcMar>
+            <w:vAlign w:val="top"/>
+          </w:tcPr>
+          <w:p>
+            <w:pPr>
+              <w:widowControl w:val="0"/>
+              <w:spacing w:line="240" w:lineRule="auto"/>
+              <w:rPr>
+                <w:sz w:val="16"/>
+                <w:szCs w:val="16"/>
+              </w:rPr>
+            </w:pPr>
+            <w:r>
+              <w:rPr>
+                <w:sz w:val="16"/>
+                <w:szCs w:val="16"/>
+                <w:rtl w:val="0"/>
+              </w:rPr>
+              <w:t xml:space="preserve">0.647854557987248</w:t>
+            </w:r>
+          </w:p>
+        </w:tc>
+        <w:tc>
+          <w:tcPr>
+            <w:shd w:fill="auto" w:val="clear"/>
+            <w:tcMar>
+              <w:top w:w="100.0" w:type="dxa"/>
+              <w:left w:w="100.0" w:type="dxa"/>
+              <w:bottom w:w="100.0" w:type="dxa"/>
+              <w:right w:w="100.0" w:type="dxa"/>
+            </w:tcMar>
+            <w:vAlign w:val="top"/>
+          </w:tcPr>
+          <w:p>
+            <w:pPr>
+              <w:widowControl w:val="0"/>
+              <w:spacing w:line="240" w:lineRule="auto"/>
+              <w:rPr>
+                <w:sz w:val="16"/>
+                <w:szCs w:val="16"/>
+              </w:rPr>
+            </w:pPr>
+            <w:r>
+              <w:rPr>
+                <w:sz w:val="16"/>
+                <w:szCs w:val="16"/>
+                <w:rtl w:val="0"/>
+              </w:rPr>
+              <w:t xml:space="preserve">0.35873946565489545</w:t>
+            </w:r>
+          </w:p>
+        </w:tc>
+        <w:tc>
+          <w:tcPr>
+            <w:shd w:fill="auto" w:val="clear"/>
+            <w:tcMar>
+              <w:top w:w="100.0" w:type="dxa"/>
+              <w:left w:w="100.0" w:type="dxa"/>
+              <w:bottom w:w="100.0" w:type="dxa"/>
+              <w:right w:w="100.0" w:type="dxa"/>
+            </w:tcMar>
+            <w:vAlign w:val="top"/>
+          </w:tcPr>
+          <w:p>
+            <w:pPr>
+              <w:widowControl w:val="0"/>
+              <w:spacing w:line="240" w:lineRule="auto"/>
+              <w:rPr>
+                <w:sz w:val="16"/>
+                <w:szCs w:val="16"/>
+              </w:rPr>
+            </w:pPr>
+            <w:r>
+              <w:rPr>
+                <w:sz w:val="16"/>
+                <w:szCs w:val="16"/>
+                <w:rtl w:val="0"/>
+              </w:rPr>
+              <w:t xml:space="preserve">0.5933246222020224</w:t>
             </w:r>
           </w:p>
         </w:tc>
@@ -3831,89 +3879,101 @@
             </w:pPr>
             <w:r>
               <w:rPr>
-                <w:rtl w:val="0"/>
-              </w:rPr>
-            </w:r>
-          </w:p>
-        </w:tc>
-        <w:tc>
-          <w:tcPr>
-            <w:shd w:fill="auto" w:val="clear"/>
-            <w:tcMar>
-              <w:top w:w="100.0" w:type="dxa"/>
-              <w:left w:w="100.0" w:type="dxa"/>
-              <w:bottom w:w="100.0" w:type="dxa"/>
-              <w:right w:w="100.0" w:type="dxa"/>
-            </w:tcMar>
-            <w:vAlign w:val="top"/>
-          </w:tcPr>
-          <w:p>
-            <w:pPr>
-              <w:widowControl w:val="0"/>
-              <w:spacing w:line="240" w:lineRule="auto"/>
-              <w:rPr>
-                <w:sz w:val="16"/>
-                <w:szCs w:val="16"/>
-              </w:rPr>
-            </w:pPr>
-            <w:r>
-              <w:rPr>
-                <w:rtl w:val="0"/>
-              </w:rPr>
-            </w:r>
-          </w:p>
-        </w:tc>
-        <w:tc>
-          <w:tcPr>
-            <w:shd w:fill="auto" w:val="clear"/>
-            <w:tcMar>
-              <w:top w:w="100.0" w:type="dxa"/>
-              <w:left w:w="100.0" w:type="dxa"/>
-              <w:bottom w:w="100.0" w:type="dxa"/>
-              <w:right w:w="100.0" w:type="dxa"/>
-            </w:tcMar>
-            <w:vAlign w:val="top"/>
-          </w:tcPr>
-          <w:p>
-            <w:pPr>
-              <w:widowControl w:val="0"/>
-              <w:spacing w:line="240" w:lineRule="auto"/>
-              <w:rPr>
-                <w:sz w:val="16"/>
-                <w:szCs w:val="16"/>
-              </w:rPr>
-            </w:pPr>
-            <w:r>
-              <w:rPr>
-                <w:rtl w:val="0"/>
-              </w:rPr>
-            </w:r>
-          </w:p>
-        </w:tc>
-        <w:tc>
-          <w:tcPr>
-            <w:shd w:fill="auto" w:val="clear"/>
-            <w:tcMar>
-              <w:top w:w="100.0" w:type="dxa"/>
-              <w:left w:w="100.0" w:type="dxa"/>
-              <w:bottom w:w="100.0" w:type="dxa"/>
-              <w:right w:w="100.0" w:type="dxa"/>
-            </w:tcMar>
-            <w:vAlign w:val="top"/>
-          </w:tcPr>
-          <w:p>
-            <w:pPr>
-              <w:widowControl w:val="0"/>
-              <w:spacing w:line="240" w:lineRule="auto"/>
-              <w:rPr>
-                <w:sz w:val="16"/>
-                <w:szCs w:val="16"/>
-              </w:rPr>
-            </w:pPr>
-            <w:r>
-              <w:rPr>
-                <w:rtl w:val="0"/>
-              </w:rPr>
+                <w:sz w:val="16"/>
+                <w:szCs w:val="16"/>
+                <w:rtl w:val="0"/>
+              </w:rPr>
+              <w:t xml:space="preserve">0.2010626302304711</w:t>
+            </w:r>
+          </w:p>
+        </w:tc>
+        <w:tc>
+          <w:tcPr>
+            <w:shd w:fill="auto" w:val="clear"/>
+            <w:tcMar>
+              <w:top w:w="100.0" w:type="dxa"/>
+              <w:left w:w="100.0" w:type="dxa"/>
+              <w:bottom w:w="100.0" w:type="dxa"/>
+              <w:right w:w="100.0" w:type="dxa"/>
+            </w:tcMar>
+            <w:vAlign w:val="top"/>
+          </w:tcPr>
+          <w:p>
+            <w:pPr>
+              <w:widowControl w:val="0"/>
+              <w:spacing w:line="240" w:lineRule="auto"/>
+              <w:rPr>
+                <w:sz w:val="16"/>
+                <w:szCs w:val="16"/>
+              </w:rPr>
+            </w:pPr>
+            <w:r>
+              <w:rPr>
+                <w:sz w:val="16"/>
+                <w:szCs w:val="16"/>
+                <w:rtl w:val="0"/>
+              </w:rPr>
+              <w:t xml:space="preserve">0.631865291351764</w:t>
+            </w:r>
+          </w:p>
+        </w:tc>
+        <w:tc>
+          <w:tcPr>
+            <w:shd w:fill="auto" w:val="clear"/>
+            <w:tcMar>
+              <w:top w:w="100.0" w:type="dxa"/>
+              <w:left w:w="100.0" w:type="dxa"/>
+              <w:bottom w:w="100.0" w:type="dxa"/>
+              <w:right w:w="100.0" w:type="dxa"/>
+            </w:tcMar>
+            <w:vAlign w:val="top"/>
+          </w:tcPr>
+          <w:p>
+            <w:pPr>
+              <w:widowControl w:val="0"/>
+              <w:spacing w:line="240" w:lineRule="auto"/>
+              <w:rPr>
+                <w:sz w:val="16"/>
+                <w:szCs w:val="16"/>
+              </w:rPr>
+            </w:pPr>
+            <w:r>
+              <w:rPr>
+                <w:sz w:val="16"/>
+                <w:szCs w:val="16"/>
+                <w:rtl w:val="0"/>
+              </w:rPr>
+              <w:t xml:space="preserve">0.31008230027192385</w:t>
+            </w:r>
+          </w:p>
+        </w:tc>
+        <w:tc>
+          <w:tcPr>
+            <w:shd w:fill="auto" w:val="clear"/>
+            <w:tcMar>
+              <w:top w:w="100.0" w:type="dxa"/>
+              <w:left w:w="100.0" w:type="dxa"/>
+              <w:bottom w:w="100.0" w:type="dxa"/>
+              <w:right w:w="100.0" w:type="dxa"/>
+            </w:tcMar>
+            <w:vAlign w:val="top"/>
+          </w:tcPr>
+          <w:p>
+            <w:pPr>
+              <w:widowControl w:val="0"/>
+              <w:spacing w:line="240" w:lineRule="auto"/>
+              <w:rPr>
+                <w:sz w:val="16"/>
+                <w:szCs w:val="16"/>
+              </w:rPr>
+            </w:pPr>
+            <w:r>
+              <w:rPr>
+                <w:sz w:val="16"/>
+                <w:szCs w:val="16"/>
+                <w:rtl w:val="0"/>
+              </w:rPr>
+              <w:t xml:space="preserve">0.5490512441767981</w:t>
             </w:r>
           </w:p>
         </w:tc>
@@ -4111,89 +4171,101 @@
             </w:pPr>
             <w:r>
               <w:rPr>
-                <w:rtl w:val="0"/>
-              </w:rPr>
-            </w:r>
-          </w:p>
-        </w:tc>
-        <w:tc>
-          <w:tcPr>
-            <w:shd w:fill="auto" w:val="clear"/>
-            <w:tcMar>
-              <w:top w:w="100.0" w:type="dxa"/>
-              <w:left w:w="100.0" w:type="dxa"/>
-              <w:bottom w:w="100.0" w:type="dxa"/>
-              <w:right w:w="100.0" w:type="dxa"/>
-            </w:tcMar>
-            <w:vAlign w:val="top"/>
-          </w:tcPr>
-          <w:p>
-            <w:pPr>
-              <w:widowControl w:val="0"/>
-              <w:spacing w:line="240" w:lineRule="auto"/>
-              <w:rPr>
-                <w:sz w:val="16"/>
-                <w:szCs w:val="16"/>
-              </w:rPr>
-            </w:pPr>
-            <w:r>
-              <w:rPr>
-                <w:rtl w:val="0"/>
-              </w:rPr>
-            </w:r>
-          </w:p>
-        </w:tc>
-        <w:tc>
-          <w:tcPr>
-            <w:shd w:fill="auto" w:val="clear"/>
-            <w:tcMar>
-              <w:top w:w="100.0" w:type="dxa"/>
-              <w:left w:w="100.0" w:type="dxa"/>
-              <w:bottom w:w="100.0" w:type="dxa"/>
-              <w:right w:w="100.0" w:type="dxa"/>
-            </w:tcMar>
-            <w:vAlign w:val="top"/>
-          </w:tcPr>
-          <w:p>
-            <w:pPr>
-              <w:widowControl w:val="0"/>
-              <w:spacing w:line="240" w:lineRule="auto"/>
-              <w:rPr>
-                <w:sz w:val="16"/>
-                <w:szCs w:val="16"/>
-              </w:rPr>
-            </w:pPr>
-            <w:r>
-              <w:rPr>
-                <w:rtl w:val="0"/>
-              </w:rPr>
-            </w:r>
-          </w:p>
-        </w:tc>
-        <w:tc>
-          <w:tcPr>
-            <w:shd w:fill="auto" w:val="clear"/>
-            <w:tcMar>
-              <w:top w:w="100.0" w:type="dxa"/>
-              <w:left w:w="100.0" w:type="dxa"/>
-              <w:bottom w:w="100.0" w:type="dxa"/>
-              <w:right w:w="100.0" w:type="dxa"/>
-            </w:tcMar>
-            <w:vAlign w:val="top"/>
-          </w:tcPr>
-          <w:p>
-            <w:pPr>
-              <w:widowControl w:val="0"/>
-              <w:spacing w:line="240" w:lineRule="auto"/>
-              <w:rPr>
-                <w:sz w:val="16"/>
-                <w:szCs w:val="16"/>
-              </w:rPr>
-            </w:pPr>
-            <w:r>
-              <w:rPr>
-                <w:rtl w:val="0"/>
-              </w:rPr>
+                <w:sz w:val="16"/>
+                <w:szCs w:val="16"/>
+                <w:rtl w:val="0"/>
+              </w:rPr>
+              <w:t xml:space="preserve">0.18379863193329118</w:t>
+            </w:r>
+          </w:p>
+        </w:tc>
+        <w:tc>
+          <w:tcPr>
+            <w:shd w:fill="auto" w:val="clear"/>
+            <w:tcMar>
+              <w:top w:w="100.0" w:type="dxa"/>
+              <w:left w:w="100.0" w:type="dxa"/>
+              <w:bottom w:w="100.0" w:type="dxa"/>
+              <w:right w:w="100.0" w:type="dxa"/>
+            </w:tcMar>
+            <w:vAlign w:val="top"/>
+          </w:tcPr>
+          <w:p>
+            <w:pPr>
+              <w:widowControl w:val="0"/>
+              <w:spacing w:line="240" w:lineRule="auto"/>
+              <w:rPr>
+                <w:sz w:val="16"/>
+                <w:szCs w:val="16"/>
+              </w:rPr>
+            </w:pPr>
+            <w:r>
+              <w:rPr>
+                <w:sz w:val="16"/>
+                <w:szCs w:val="16"/>
+                <w:rtl w:val="0"/>
+              </w:rPr>
+              <w:t xml:space="preserve">0.6035425026464144</w:t>
+            </w:r>
+          </w:p>
+        </w:tc>
+        <w:tc>
+          <w:tcPr>
+            <w:shd w:fill="auto" w:val="clear"/>
+            <w:tcMar>
+              <w:top w:w="100.0" w:type="dxa"/>
+              <w:left w:w="100.0" w:type="dxa"/>
+              <w:bottom w:w="100.0" w:type="dxa"/>
+              <w:right w:w="100.0" w:type="dxa"/>
+            </w:tcMar>
+            <w:vAlign w:val="top"/>
+          </w:tcPr>
+          <w:p>
+            <w:pPr>
+              <w:widowControl w:val="0"/>
+              <w:spacing w:line="240" w:lineRule="auto"/>
+              <w:rPr>
+                <w:sz w:val="16"/>
+                <w:szCs w:val="16"/>
+              </w:rPr>
+            </w:pPr>
+            <w:r>
+              <w:rPr>
+                <w:sz w:val="16"/>
+                <w:szCs w:val="16"/>
+                <w:rtl w:val="0"/>
+              </w:rPr>
+              <w:t xml:space="preserve">0.3406815068328446</w:t>
+            </w:r>
+          </w:p>
+        </w:tc>
+        <w:tc>
+          <w:tcPr>
+            <w:shd w:fill="auto" w:val="clear"/>
+            <w:tcMar>
+              <w:top w:w="100.0" w:type="dxa"/>
+              <w:left w:w="100.0" w:type="dxa"/>
+              <w:bottom w:w="100.0" w:type="dxa"/>
+              <w:right w:w="100.0" w:type="dxa"/>
+            </w:tcMar>
+            <w:vAlign w:val="top"/>
+          </w:tcPr>
+          <w:p>
+            <w:pPr>
+              <w:widowControl w:val="0"/>
+              <w:spacing w:line="240" w:lineRule="auto"/>
+              <w:rPr>
+                <w:sz w:val="16"/>
+                <w:szCs w:val="16"/>
+              </w:rPr>
+            </w:pPr>
+            <w:r>
+              <w:rPr>
+                <w:sz w:val="16"/>
+                <w:szCs w:val="16"/>
+                <w:rtl w:val="0"/>
+              </w:rPr>
+              <w:t xml:space="preserve">0.5774457448017271</w:t>
             </w:r>
           </w:p>
         </w:tc>
@@ -4208,6 +4280,26 @@
           <w:rtl w:val="0"/>
         </w:rPr>
         <w:t xml:space="preserve">Retain with our normal loss vs using focal loss vs using bidirectionality </w:t>
+      </w:r>
+    </w:p>
+    <w:p>
+      <w:pPr>
+        <w:rPr/>
+      </w:pPr>
+      <w:r>
+        <w:rPr>
+          <w:rtl w:val="0"/>
+        </w:rPr>
+      </w:r>
+    </w:p>
+    <w:p>
+      <w:pPr>
+        <w:rPr/>
+      </w:pPr>
+      <w:r>
+        <w:rPr>
+          <w:rtl w:val="0"/>
+        </w:rPr>
       </w:r>
     </w:p>
     <w:p>

</xml_diff>

<commit_message>
Ok now all table values should be right
</commit_message>
<xml_diff>
--- a/Tables_to_Fill.docx
+++ b/Tables_to_Fill.docx
@@ -1434,97 +1434,97 @@
                 <w:szCs w:val="16"/>
                 <w:rtl w:val="0"/>
               </w:rPr>
-              <w:t xml:space="preserve">0.1501936075860243</w:t>
-            </w:r>
-          </w:p>
-        </w:tc>
-        <w:tc>
-          <w:tcPr>
-            <w:shd w:fill="auto" w:val="clear"/>
-            <w:tcMar>
-              <w:top w:w="100.0" w:type="dxa"/>
-              <w:left w:w="100.0" w:type="dxa"/>
-              <w:bottom w:w="100.0" w:type="dxa"/>
-              <w:right w:w="100.0" w:type="dxa"/>
-            </w:tcMar>
-            <w:vAlign w:val="top"/>
-          </w:tcPr>
-          <w:p>
-            <w:pPr>
-              <w:widowControl w:val="0"/>
-              <w:spacing w:line="240" w:lineRule="auto"/>
-              <w:rPr>
-                <w:sz w:val="16"/>
-                <w:szCs w:val="16"/>
-              </w:rPr>
-            </w:pPr>
-            <w:r>
-              <w:rPr>
-                <w:sz w:val="16"/>
-                <w:szCs w:val="16"/>
-                <w:rtl w:val="0"/>
-              </w:rPr>
-              <w:t xml:space="preserve">0.6161591295142905</w:t>
-            </w:r>
-          </w:p>
-        </w:tc>
-        <w:tc>
-          <w:tcPr>
-            <w:shd w:fill="auto" w:val="clear"/>
-            <w:tcMar>
-              <w:top w:w="100.0" w:type="dxa"/>
-              <w:left w:w="100.0" w:type="dxa"/>
-              <w:bottom w:w="100.0" w:type="dxa"/>
-              <w:right w:w="100.0" w:type="dxa"/>
-            </w:tcMar>
-            <w:vAlign w:val="top"/>
-          </w:tcPr>
-          <w:p>
-            <w:pPr>
-              <w:widowControl w:val="0"/>
-              <w:spacing w:line="240" w:lineRule="auto"/>
-              <w:rPr>
-                <w:sz w:val="16"/>
-                <w:szCs w:val="16"/>
-              </w:rPr>
-            </w:pPr>
-            <w:r>
-              <w:rPr>
-                <w:sz w:val="16"/>
-                <w:szCs w:val="16"/>
-                <w:rtl w:val="0"/>
-              </w:rPr>
-              <w:t xml:space="preserve">0.3657651702799499</w:t>
-            </w:r>
-          </w:p>
-        </w:tc>
-        <w:tc>
-          <w:tcPr>
-            <w:shd w:fill="auto" w:val="clear"/>
-            <w:tcMar>
-              <w:top w:w="100.0" w:type="dxa"/>
-              <w:left w:w="100.0" w:type="dxa"/>
-              <w:bottom w:w="100.0" w:type="dxa"/>
-              <w:right w:w="100.0" w:type="dxa"/>
-            </w:tcMar>
-            <w:vAlign w:val="top"/>
-          </w:tcPr>
-          <w:p>
-            <w:pPr>
-              <w:widowControl w:val="0"/>
-              <w:spacing w:line="240" w:lineRule="auto"/>
-              <w:rPr>
-                <w:sz w:val="16"/>
-                <w:szCs w:val="16"/>
-              </w:rPr>
-            </w:pPr>
-            <w:r>
-              <w:rPr>
-                <w:sz w:val="16"/>
-                <w:szCs w:val="16"/>
-                <w:rtl w:val="0"/>
-              </w:rPr>
-              <w:t xml:space="preserve">0.5785791387342347</w:t>
+              <w:t xml:space="preserve">0.17878508578190253</w:t>
+            </w:r>
+          </w:p>
+        </w:tc>
+        <w:tc>
+          <w:tcPr>
+            <w:shd w:fill="auto" w:val="clear"/>
+            <w:tcMar>
+              <w:top w:w="100.0" w:type="dxa"/>
+              <w:left w:w="100.0" w:type="dxa"/>
+              <w:bottom w:w="100.0" w:type="dxa"/>
+              <w:right w:w="100.0" w:type="dxa"/>
+            </w:tcMar>
+            <w:vAlign w:val="top"/>
+          </w:tcPr>
+          <w:p>
+            <w:pPr>
+              <w:widowControl w:val="0"/>
+              <w:spacing w:line="240" w:lineRule="auto"/>
+              <w:rPr>
+                <w:sz w:val="16"/>
+                <w:szCs w:val="16"/>
+              </w:rPr>
+            </w:pPr>
+            <w:r>
+              <w:rPr>
+                <w:sz w:val="16"/>
+                <w:szCs w:val="16"/>
+                <w:rtl w:val="0"/>
+              </w:rPr>
+              <w:t xml:space="preserve">0.633416213288693</w:t>
+            </w:r>
+          </w:p>
+        </w:tc>
+        <w:tc>
+          <w:tcPr>
+            <w:shd w:fill="auto" w:val="clear"/>
+            <w:tcMar>
+              <w:top w:w="100.0" w:type="dxa"/>
+              <w:left w:w="100.0" w:type="dxa"/>
+              <w:bottom w:w="100.0" w:type="dxa"/>
+              <w:right w:w="100.0" w:type="dxa"/>
+            </w:tcMar>
+            <w:vAlign w:val="top"/>
+          </w:tcPr>
+          <w:p>
+            <w:pPr>
+              <w:widowControl w:val="0"/>
+              <w:spacing w:line="240" w:lineRule="auto"/>
+              <w:rPr>
+                <w:sz w:val="16"/>
+                <w:szCs w:val="16"/>
+              </w:rPr>
+            </w:pPr>
+            <w:r>
+              <w:rPr>
+                <w:sz w:val="16"/>
+                <w:szCs w:val="16"/>
+                <w:rtl w:val="0"/>
+              </w:rPr>
+              <w:t xml:space="preserve">0.34196518528327785</w:t>
+            </w:r>
+          </w:p>
+        </w:tc>
+        <w:tc>
+          <w:tcPr>
+            <w:shd w:fill="auto" w:val="clear"/>
+            <w:tcMar>
+              <w:top w:w="100.0" w:type="dxa"/>
+              <w:left w:w="100.0" w:type="dxa"/>
+              <w:bottom w:w="100.0" w:type="dxa"/>
+              <w:right w:w="100.0" w:type="dxa"/>
+            </w:tcMar>
+            <w:vAlign w:val="top"/>
+          </w:tcPr>
+          <w:p>
+            <w:pPr>
+              <w:widowControl w:val="0"/>
+              <w:spacing w:line="240" w:lineRule="auto"/>
+              <w:rPr>
+                <w:sz w:val="16"/>
+                <w:szCs w:val="16"/>
+              </w:rPr>
+            </w:pPr>
+            <w:r>
+              <w:rPr>
+                <w:sz w:val="16"/>
+                <w:szCs w:val="16"/>
+                <w:rtl w:val="0"/>
+              </w:rPr>
+              <w:t xml:space="preserve">0.5518406999204636</w:t>
             </w:r>
           </w:p>
         </w:tc>
@@ -1745,97 +1745,97 @@
                 <w:szCs w:val="16"/>
                 <w:rtl w:val="0"/>
               </w:rPr>
-              <w:t xml:space="preserve">0.18414804661161283</w:t>
-            </w:r>
-          </w:p>
-        </w:tc>
-        <w:tc>
-          <w:tcPr>
-            <w:shd w:fill="auto" w:val="clear"/>
-            <w:tcMar>
-              <w:top w:w="100.0" w:type="dxa"/>
-              <w:left w:w="100.0" w:type="dxa"/>
-              <w:bottom w:w="100.0" w:type="dxa"/>
-              <w:right w:w="100.0" w:type="dxa"/>
-            </w:tcMar>
-            <w:vAlign w:val="top"/>
-          </w:tcPr>
-          <w:p>
-            <w:pPr>
-              <w:widowControl w:val="0"/>
-              <w:spacing w:line="240" w:lineRule="auto"/>
-              <w:rPr>
-                <w:sz w:val="16"/>
-                <w:szCs w:val="16"/>
-              </w:rPr>
-            </w:pPr>
-            <w:r>
-              <w:rPr>
-                <w:sz w:val="16"/>
-                <w:szCs w:val="16"/>
-                <w:rtl w:val="0"/>
-              </w:rPr>
-              <w:t xml:space="preserve">0.5984712340907412</w:t>
-            </w:r>
-          </w:p>
-        </w:tc>
-        <w:tc>
-          <w:tcPr>
-            <w:shd w:fill="auto" w:val="clear"/>
-            <w:tcMar>
-              <w:top w:w="100.0" w:type="dxa"/>
-              <w:left w:w="100.0" w:type="dxa"/>
-              <w:bottom w:w="100.0" w:type="dxa"/>
-              <w:right w:w="100.0" w:type="dxa"/>
-            </w:tcMar>
-            <w:vAlign w:val="top"/>
-          </w:tcPr>
-          <w:p>
-            <w:pPr>
-              <w:widowControl w:val="0"/>
-              <w:spacing w:line="240" w:lineRule="auto"/>
-              <w:rPr>
-                <w:sz w:val="16"/>
-                <w:szCs w:val="16"/>
-              </w:rPr>
-            </w:pPr>
-            <w:r>
-              <w:rPr>
-                <w:sz w:val="16"/>
-                <w:szCs w:val="16"/>
-                <w:rtl w:val="0"/>
-              </w:rPr>
-              <w:t xml:space="preserve">0.3700682807886904</w:t>
-            </w:r>
-          </w:p>
-        </w:tc>
-        <w:tc>
-          <w:tcPr>
-            <w:shd w:fill="auto" w:val="clear"/>
-            <w:tcMar>
-              <w:top w:w="100.0" w:type="dxa"/>
-              <w:left w:w="100.0" w:type="dxa"/>
-              <w:bottom w:w="100.0" w:type="dxa"/>
-              <w:right w:w="100.0" w:type="dxa"/>
-            </w:tcMar>
-            <w:vAlign w:val="top"/>
-          </w:tcPr>
-          <w:p>
-            <w:pPr>
-              <w:widowControl w:val="0"/>
-              <w:spacing w:line="240" w:lineRule="auto"/>
-              <w:rPr>
-                <w:sz w:val="16"/>
-                <w:szCs w:val="16"/>
-              </w:rPr>
-            </w:pPr>
-            <w:r>
-              <w:rPr>
-                <w:sz w:val="16"/>
-                <w:szCs w:val="16"/>
-                <w:rtl w:val="0"/>
-              </w:rPr>
-              <w:t xml:space="preserve">0.5928019543233722</w:t>
+              <w:t xml:space="preserve">0.21098921882746696</w:t>
+            </w:r>
+          </w:p>
+        </w:tc>
+        <w:tc>
+          <w:tcPr>
+            <w:shd w:fill="auto" w:val="clear"/>
+            <w:tcMar>
+              <w:top w:w="100.0" w:type="dxa"/>
+              <w:left w:w="100.0" w:type="dxa"/>
+              <w:bottom w:w="100.0" w:type="dxa"/>
+              <w:right w:w="100.0" w:type="dxa"/>
+            </w:tcMar>
+            <w:vAlign w:val="top"/>
+          </w:tcPr>
+          <w:p>
+            <w:pPr>
+              <w:widowControl w:val="0"/>
+              <w:spacing w:line="240" w:lineRule="auto"/>
+              <w:rPr>
+                <w:sz w:val="16"/>
+                <w:szCs w:val="16"/>
+              </w:rPr>
+            </w:pPr>
+            <w:r>
+              <w:rPr>
+                <w:sz w:val="16"/>
+                <w:szCs w:val="16"/>
+                <w:rtl w:val="0"/>
+              </w:rPr>
+              <w:t xml:space="preserve">0.6557322567145073</w:t>
+            </w:r>
+          </w:p>
+        </w:tc>
+        <w:tc>
+          <w:tcPr>
+            <w:shd w:fill="auto" w:val="clear"/>
+            <w:tcMar>
+              <w:top w:w="100.0" w:type="dxa"/>
+              <w:left w:w="100.0" w:type="dxa"/>
+              <w:bottom w:w="100.0" w:type="dxa"/>
+              <w:right w:w="100.0" w:type="dxa"/>
+            </w:tcMar>
+            <w:vAlign w:val="top"/>
+          </w:tcPr>
+          <w:p>
+            <w:pPr>
+              <w:widowControl w:val="0"/>
+              <w:spacing w:line="240" w:lineRule="auto"/>
+              <w:rPr>
+                <w:sz w:val="16"/>
+                <w:szCs w:val="16"/>
+              </w:rPr>
+            </w:pPr>
+            <w:r>
+              <w:rPr>
+                <w:sz w:val="16"/>
+                <w:szCs w:val="16"/>
+                <w:rtl w:val="0"/>
+              </w:rPr>
+              <w:t xml:space="preserve">0.33337305307514353</w:t>
+            </w:r>
+          </w:p>
+        </w:tc>
+        <w:tc>
+          <w:tcPr>
+            <w:shd w:fill="auto" w:val="clear"/>
+            <w:tcMar>
+              <w:top w:w="100.0" w:type="dxa"/>
+              <w:left w:w="100.0" w:type="dxa"/>
+              <w:bottom w:w="100.0" w:type="dxa"/>
+              <w:right w:w="100.0" w:type="dxa"/>
+            </w:tcMar>
+            <w:vAlign w:val="top"/>
+          </w:tcPr>
+          <w:p>
+            <w:pPr>
+              <w:widowControl w:val="0"/>
+              <w:spacing w:line="240" w:lineRule="auto"/>
+              <w:rPr>
+                <w:sz w:val="16"/>
+                <w:szCs w:val="16"/>
+              </w:rPr>
+            </w:pPr>
+            <w:r>
+              <w:rPr>
+                <w:sz w:val="16"/>
+                <w:szCs w:val="16"/>
+                <w:rtl w:val="0"/>
+              </w:rPr>
+              <w:t xml:space="preserve">0.5825985683445064</w:t>
             </w:r>
           </w:p>
         </w:tc>
@@ -2037,97 +2037,97 @@
                 <w:szCs w:val="16"/>
                 <w:rtl w:val="0"/>
               </w:rPr>
-              <w:t xml:space="preserve">0.20787679687675675</w:t>
-            </w:r>
-          </w:p>
-        </w:tc>
-        <w:tc>
-          <w:tcPr>
-            <w:shd w:fill="auto" w:val="clear"/>
-            <w:tcMar>
-              <w:top w:w="100.0" w:type="dxa"/>
-              <w:left w:w="100.0" w:type="dxa"/>
-              <w:bottom w:w="100.0" w:type="dxa"/>
-              <w:right w:w="100.0" w:type="dxa"/>
-            </w:tcMar>
-            <w:vAlign w:val="top"/>
-          </w:tcPr>
-          <w:p>
-            <w:pPr>
-              <w:widowControl w:val="0"/>
-              <w:spacing w:line="240" w:lineRule="auto"/>
-              <w:rPr>
-                <w:sz w:val="16"/>
-                <w:szCs w:val="16"/>
-              </w:rPr>
-            </w:pPr>
-            <w:r>
-              <w:rPr>
-                <w:sz w:val="16"/>
-                <w:szCs w:val="16"/>
-                <w:rtl w:val="0"/>
-              </w:rPr>
-              <w:t xml:space="preserve">0.6646069766869354</w:t>
-            </w:r>
-          </w:p>
-        </w:tc>
-        <w:tc>
-          <w:tcPr>
-            <w:shd w:fill="auto" w:val="clear"/>
-            <w:tcMar>
-              <w:top w:w="100.0" w:type="dxa"/>
-              <w:left w:w="100.0" w:type="dxa"/>
-              <w:bottom w:w="100.0" w:type="dxa"/>
-              <w:right w:w="100.0" w:type="dxa"/>
-            </w:tcMar>
-            <w:vAlign w:val="top"/>
-          </w:tcPr>
-          <w:p>
-            <w:pPr>
-              <w:widowControl w:val="0"/>
-              <w:spacing w:line="240" w:lineRule="auto"/>
-              <w:rPr>
-                <w:sz w:val="16"/>
-                <w:szCs w:val="16"/>
-              </w:rPr>
-            </w:pPr>
-            <w:r>
-              <w:rPr>
-                <w:sz w:val="16"/>
-                <w:szCs w:val="16"/>
-                <w:rtl w:val="0"/>
-              </w:rPr>
-              <w:t xml:space="preserve">0.379196039050761</w:t>
-            </w:r>
-          </w:p>
-        </w:tc>
-        <w:tc>
-          <w:tcPr>
-            <w:shd w:fill="auto" w:val="clear"/>
-            <w:tcMar>
-              <w:top w:w="100.0" w:type="dxa"/>
-              <w:left w:w="100.0" w:type="dxa"/>
-              <w:bottom w:w="100.0" w:type="dxa"/>
-              <w:right w:w="100.0" w:type="dxa"/>
-            </w:tcMar>
-            <w:vAlign w:val="top"/>
-          </w:tcPr>
-          <w:p>
-            <w:pPr>
-              <w:widowControl w:val="0"/>
-              <w:spacing w:line="240" w:lineRule="auto"/>
-              <w:rPr>
-                <w:sz w:val="16"/>
-                <w:szCs w:val="16"/>
-              </w:rPr>
-            </w:pPr>
-            <w:r>
-              <w:rPr>
-                <w:sz w:val="16"/>
-                <w:szCs w:val="16"/>
-                <w:rtl w:val="0"/>
-              </w:rPr>
-              <w:t xml:space="preserve">0.6028576298147938</w:t>
+              <w:t xml:space="preserve">0.20588662128686103</w:t>
+            </w:r>
+          </w:p>
+        </w:tc>
+        <w:tc>
+          <w:tcPr>
+            <w:shd w:fill="auto" w:val="clear"/>
+            <w:tcMar>
+              <w:top w:w="100.0" w:type="dxa"/>
+              <w:left w:w="100.0" w:type="dxa"/>
+              <w:bottom w:w="100.0" w:type="dxa"/>
+              <w:right w:w="100.0" w:type="dxa"/>
+            </w:tcMar>
+            <w:vAlign w:val="top"/>
+          </w:tcPr>
+          <w:p>
+            <w:pPr>
+              <w:widowControl w:val="0"/>
+              <w:spacing w:line="240" w:lineRule="auto"/>
+              <w:rPr>
+                <w:sz w:val="16"/>
+                <w:szCs w:val="16"/>
+              </w:rPr>
+            </w:pPr>
+            <w:r>
+              <w:rPr>
+                <w:sz w:val="16"/>
+                <w:szCs w:val="16"/>
+                <w:rtl w:val="0"/>
+              </w:rPr>
+              <w:t xml:space="preserve">0.6534674183304202</w:t>
+            </w:r>
+          </w:p>
+        </w:tc>
+        <w:tc>
+          <w:tcPr>
+            <w:shd w:fill="auto" w:val="clear"/>
+            <w:tcMar>
+              <w:top w:w="100.0" w:type="dxa"/>
+              <w:left w:w="100.0" w:type="dxa"/>
+              <w:bottom w:w="100.0" w:type="dxa"/>
+              <w:right w:w="100.0" w:type="dxa"/>
+            </w:tcMar>
+            <w:vAlign w:val="top"/>
+          </w:tcPr>
+          <w:p>
+            <w:pPr>
+              <w:widowControl w:val="0"/>
+              <w:spacing w:line="240" w:lineRule="auto"/>
+              <w:rPr>
+                <w:sz w:val="16"/>
+                <w:szCs w:val="16"/>
+              </w:rPr>
+            </w:pPr>
+            <w:r>
+              <w:rPr>
+                <w:sz w:val="16"/>
+                <w:szCs w:val="16"/>
+                <w:rtl w:val="0"/>
+              </w:rPr>
+              <w:t xml:space="preserve">0.36810306353331756</w:t>
+            </w:r>
+          </w:p>
+        </w:tc>
+        <w:tc>
+          <w:tcPr>
+            <w:shd w:fill="auto" w:val="clear"/>
+            <w:tcMar>
+              <w:top w:w="100.0" w:type="dxa"/>
+              <w:left w:w="100.0" w:type="dxa"/>
+              <w:bottom w:w="100.0" w:type="dxa"/>
+              <w:right w:w="100.0" w:type="dxa"/>
+            </w:tcMar>
+            <w:vAlign w:val="top"/>
+          </w:tcPr>
+          <w:p>
+            <w:pPr>
+              <w:widowControl w:val="0"/>
+              <w:spacing w:line="240" w:lineRule="auto"/>
+              <w:rPr>
+                <w:sz w:val="16"/>
+                <w:szCs w:val="16"/>
+              </w:rPr>
+            </w:pPr>
+            <w:r>
+              <w:rPr>
+                <w:sz w:val="16"/>
+                <w:szCs w:val="16"/>
+                <w:rtl w:val="0"/>
+              </w:rPr>
+              <w:t xml:space="preserve">0.5922508805817521</w:t>
             </w:r>
           </w:p>
         </w:tc>

</xml_diff>